<commit_message>
cập nhật mô hình ERD và cuốn báo cáo
</commit_message>
<xml_diff>
--- a/BaoCaoKTM_NhomTripleCode/BaoCaoKetThucMon_CNPM_DA22TTC.docx
+++ b/BaoCaoKTM_NhomTripleCode/BaoCaoKetThucMon_CNPM_DA22TTC.docx
@@ -6308,8 +6308,6 @@
           <w:docGrid w:linePitch="360" w:charSpace="0"/>
         </w:sectPr>
       </w:pPr>
-      <w:bookmarkStart w:id="58" w:name="_GoBack"/>
-      <w:bookmarkEnd w:id="58"/>
     </w:p>
     <w:p>
       <w:pPr>
@@ -6322,9 +6320,9 @@
       </w:pPr>
       <w:bookmarkStart w:id="4" w:name="_Toc22092"/>
       <w:bookmarkStart w:id="5" w:name="_Toc6768"/>
-      <w:bookmarkStart w:id="6" w:name="_Toc1419809179"/>
+      <w:bookmarkStart w:id="6" w:name="_Toc2064234370"/>
       <w:bookmarkStart w:id="7" w:name="_Toc155038921"/>
-      <w:bookmarkStart w:id="8" w:name="_Toc2064234370"/>
+      <w:bookmarkStart w:id="8" w:name="_Toc1419809179"/>
       <w:r>
         <w:rPr>
           <w:rStyle w:val="36"/>
@@ -7030,13 +7028,13 @@
         <w:pStyle w:val="35"/>
         <w:bidi w:val="0"/>
       </w:pPr>
-      <w:bookmarkStart w:id="10" w:name="_Toc16654"/>
-      <w:bookmarkStart w:id="11" w:name="_Toc3497"/>
-      <w:bookmarkStart w:id="12" w:name="_Toc8637"/>
-      <w:bookmarkStart w:id="13" w:name="_Toc10720"/>
-      <w:bookmarkStart w:id="14" w:name="_Toc15361"/>
-      <w:bookmarkStart w:id="15" w:name="_Toc31689"/>
-      <w:bookmarkStart w:id="16" w:name="_Toc10977"/>
+      <w:bookmarkStart w:id="10" w:name="_Toc3497"/>
+      <w:bookmarkStart w:id="11" w:name="_Toc16654"/>
+      <w:bookmarkStart w:id="12" w:name="_Toc10977"/>
+      <w:bookmarkStart w:id="13" w:name="_Toc8637"/>
+      <w:bookmarkStart w:id="14" w:name="_Toc10720"/>
+      <w:bookmarkStart w:id="15" w:name="_Toc15361"/>
+      <w:bookmarkStart w:id="16" w:name="_Toc31689"/>
       <w:bookmarkStart w:id="17" w:name="_Toc15225"/>
       <w:r>
         <w:t>Đồ án môn học với đề tài “Tìm hiểu về Node.js và xây dựng website nhà hàng Ẩm Thực Phương Nam Trà Vinh” được thực hiện với mục tiêu nghiên cứu nền tảng lập trình backend hiện đại Node.js, đồng thời áp dụng vào việc xây dựng một hệ thống website giới thiệu và quản lý hoạt động của nhà hàng. Trong quá trình thực hiện, nhóm đã tìm hiểu các khái niệm cơ bản về Node.js, Express.js, cũng như cách kết nối cơ sở dữ liệu MySQL để xây dựng một hệ thống có khả năng xử lý yêu cầu nhanh, gọn, hiệu quả. Website gồm các chức năng chính như: hiển thị thực đơn món ăn theo từng loại, đặt bàn trực tuyến, đặt món ăn, quản lý hóa đơn và chi tiết hóa đơn, quản lý danh mục món ăn từ giao diện admin. Giao diện được thiết kế thân thiện, dễ sử dụng, tương thích nhiều thiết bị, sử dụng HTML, CSS</w:t>
@@ -8867,6 +8865,7 @@
       <w:pPr>
         <w:pStyle w:val="35"/>
         <w:numPr>
+          <w:ilvl w:val="0"/>
           <w:numId w:val="0"/>
         </w:numPr>
         <w:bidi w:val="0"/>
@@ -9695,6 +9694,7 @@
     </w:p>
     <w:tbl>
       <w:tblPr>
+        <w:tblStyle w:val="12"/>
         <w:tblW w:w="0" w:type="auto"/>
         <w:tblCellSpacing w:w="15" w:type="dxa"/>
         <w:tblInd w:w="0" w:type="dxa"/>
@@ -9706,7 +9706,7 @@
           <w:insideH w:val="single" w:color="auto" w:sz="4" w:space="0"/>
           <w:insideV w:val="single" w:color="auto" w:sz="4" w:space="0"/>
         </w:tblBorders>
-        <w:shd w:val="clear"/>
+        <w:shd w:val="clear" w:color="auto" w:fill="auto"/>
         <w:tblLayout w:type="autofit"/>
         <w:tblCellMar>
           <w:top w:w="15" w:type="dxa"/>
@@ -9747,7 +9747,7 @@
               <w:tl2br w:val="nil"/>
               <w:tr2bl w:val="nil"/>
             </w:tcBorders>
-            <w:shd w:val="clear"/>
+            <w:shd w:val="clear" w:color="auto" w:fill="auto"/>
             <w:vAlign w:val="center"/>
           </w:tcPr>
           <w:p>
@@ -9778,7 +9778,7 @@
               <w:tl2br w:val="nil"/>
               <w:tr2bl w:val="nil"/>
             </w:tcBorders>
-            <w:shd w:val="clear"/>
+            <w:shd w:val="clear" w:color="auto" w:fill="auto"/>
             <w:vAlign w:val="center"/>
           </w:tcPr>
           <w:p>
@@ -9812,6 +9812,7 @@
             <w:insideH w:val="single" w:color="auto" w:sz="4" w:space="0"/>
             <w:insideV w:val="single" w:color="auto" w:sz="4" w:space="0"/>
           </w:tblBorders>
+          <w:shd w:val="clear" w:color="auto" w:fill="auto"/>
           <w:tblCellMar>
             <w:top w:w="15" w:type="dxa"/>
             <w:left w:w="15" w:type="dxa"/>
@@ -9829,7 +9830,7 @@
               <w:tl2br w:val="nil"/>
               <w:tr2bl w:val="nil"/>
             </w:tcBorders>
-            <w:shd w:val="clear"/>
+            <w:shd w:val="clear" w:color="auto" w:fill="auto"/>
             <w:vAlign w:val="center"/>
           </w:tcPr>
           <w:p>
@@ -9860,7 +9861,7 @@
               <w:tl2br w:val="nil"/>
               <w:tr2bl w:val="nil"/>
             </w:tcBorders>
-            <w:shd w:val="clear"/>
+            <w:shd w:val="clear" w:color="auto" w:fill="auto"/>
             <w:vAlign w:val="center"/>
           </w:tcPr>
           <w:p>
@@ -9899,6 +9900,7 @@
             <w:insideH w:val="single" w:color="auto" w:sz="4" w:space="0"/>
             <w:insideV w:val="single" w:color="auto" w:sz="4" w:space="0"/>
           </w:tblBorders>
+          <w:shd w:val="clear" w:color="auto" w:fill="auto"/>
           <w:tblCellMar>
             <w:top w:w="15" w:type="dxa"/>
             <w:left w:w="15" w:type="dxa"/>
@@ -9916,7 +9918,7 @@
               <w:tl2br w:val="nil"/>
               <w:tr2bl w:val="nil"/>
             </w:tcBorders>
-            <w:shd w:val="clear"/>
+            <w:shd w:val="clear" w:color="auto" w:fill="auto"/>
             <w:vAlign w:val="center"/>
           </w:tcPr>
           <w:p>
@@ -9947,7 +9949,7 @@
               <w:tl2br w:val="nil"/>
               <w:tr2bl w:val="nil"/>
             </w:tcBorders>
-            <w:shd w:val="clear"/>
+            <w:shd w:val="clear" w:color="auto" w:fill="auto"/>
             <w:vAlign w:val="center"/>
           </w:tcPr>
           <w:p>
@@ -9986,7 +9988,7 @@
             <w:insideH w:val="single" w:color="auto" w:sz="4" w:space="0"/>
             <w:insideV w:val="single" w:color="auto" w:sz="4" w:space="0"/>
           </w:tblBorders>
-          <w:shd w:val="clear"/>
+          <w:shd w:val="clear" w:color="auto" w:fill="auto"/>
           <w:tblCellMar>
             <w:top w:w="15" w:type="dxa"/>
             <w:left w:w="15" w:type="dxa"/>
@@ -10004,7 +10006,7 @@
               <w:tl2br w:val="nil"/>
               <w:tr2bl w:val="nil"/>
             </w:tcBorders>
-            <w:shd w:val="clear"/>
+            <w:shd w:val="clear" w:color="auto" w:fill="auto"/>
             <w:vAlign w:val="center"/>
           </w:tcPr>
           <w:p>
@@ -10035,7 +10037,7 @@
               <w:tl2br w:val="nil"/>
               <w:tr2bl w:val="nil"/>
             </w:tcBorders>
-            <w:shd w:val="clear"/>
+            <w:shd w:val="clear" w:color="auto" w:fill="auto"/>
             <w:vAlign w:val="center"/>
           </w:tcPr>
           <w:p>
@@ -10074,6 +10076,7 @@
             <w:insideH w:val="single" w:color="auto" w:sz="4" w:space="0"/>
             <w:insideV w:val="single" w:color="auto" w:sz="4" w:space="0"/>
           </w:tblBorders>
+          <w:shd w:val="clear" w:color="auto" w:fill="auto"/>
           <w:tblCellMar>
             <w:top w:w="15" w:type="dxa"/>
             <w:left w:w="15" w:type="dxa"/>
@@ -10091,7 +10094,7 @@
               <w:tl2br w:val="nil"/>
               <w:tr2bl w:val="nil"/>
             </w:tcBorders>
-            <w:shd w:val="clear"/>
+            <w:shd w:val="clear" w:color="auto" w:fill="auto"/>
             <w:vAlign w:val="center"/>
           </w:tcPr>
           <w:p>
@@ -10122,7 +10125,7 @@
               <w:tl2br w:val="nil"/>
               <w:tr2bl w:val="nil"/>
             </w:tcBorders>
-            <w:shd w:val="clear"/>
+            <w:shd w:val="clear" w:color="auto" w:fill="auto"/>
             <w:vAlign w:val="center"/>
           </w:tcPr>
           <w:p>
@@ -11633,13 +11636,21 @@
       <w:pPr>
         <w:pStyle w:val="35"/>
         <w:bidi w:val="0"/>
-      </w:pPr>
-      <w:r>
+        <w:rPr>
+          <w:rFonts w:hint="default"/>
+          <w:lang w:val="vi-VN"/>
+        </w:rPr>
+      </w:pPr>
+      <w:r>
+        <w:rPr>
+          <w:rFonts w:hint="default"/>
+          <w:lang w:val="vi-VN"/>
+        </w:rPr>
         <w:drawing>
           <wp:inline distT="0" distB="0" distL="114300" distR="114300">
-            <wp:extent cx="3940810" cy="2947670"/>
-            <wp:effectExtent l="0" t="0" r="6350" b="8890"/>
-            <wp:docPr id="59" name="Picture 1"/>
+            <wp:extent cx="5575300" cy="4430395"/>
+            <wp:effectExtent l="0" t="0" r="2540" b="4445"/>
+            <wp:docPr id="3" name="Picture 3" descr="erd-nha-hang"/>
             <wp:cNvGraphicFramePr>
               <a:graphicFrameLocks xmlns:a="http://schemas.openxmlformats.org/drawingml/2006/main" noChangeAspect="1"/>
             </wp:cNvGraphicFramePr>
@@ -11647,7 +11658,7 @@
               <a:graphicData uri="http://schemas.openxmlformats.org/drawingml/2006/picture">
                 <pic:pic xmlns:pic="http://schemas.openxmlformats.org/drawingml/2006/picture">
                   <pic:nvPicPr>
-                    <pic:cNvPr id="59" name="Picture 1"/>
+                    <pic:cNvPr id="3" name="Picture 3" descr="erd-nha-hang"/>
                     <pic:cNvPicPr>
                       <a:picLocks noChangeAspect="1"/>
                     </pic:cNvPicPr>
@@ -11661,15 +11672,11 @@
                   <pic:spPr>
                     <a:xfrm>
                       <a:off x="0" y="0"/>
-                      <a:ext cx="3940810" cy="2947670"/>
+                      <a:ext cx="5575300" cy="4430395"/>
                     </a:xfrm>
                     <a:prstGeom prst="rect">
                       <a:avLst/>
                     </a:prstGeom>
-                    <a:noFill/>
-                    <a:ln>
-                      <a:noFill/>
-                    </a:ln>
                   </pic:spPr>
                 </pic:pic>
               </a:graphicData>
@@ -11742,51 +11749,7 @@
       <w:pPr>
         <w:pStyle w:val="35"/>
         <w:bidi w:val="0"/>
-        <w:rPr>
-          <w:rFonts w:hint="default"/>
-        </w:rPr>
-      </w:pPr>
-    </w:p>
-    <w:p>
-      <w:pPr>
-        <w:pStyle w:val="35"/>
-        <w:bidi w:val="0"/>
-        <w:rPr>
-          <w:rFonts w:hint="default"/>
-        </w:rPr>
-      </w:pPr>
-    </w:p>
-    <w:p>
-      <w:pPr>
-        <w:pStyle w:val="35"/>
-        <w:bidi w:val="0"/>
-        <w:rPr>
-          <w:rFonts w:hint="default"/>
-        </w:rPr>
-      </w:pPr>
-    </w:p>
-    <w:p>
-      <w:pPr>
-        <w:pStyle w:val="35"/>
-        <w:bidi w:val="0"/>
-        <w:rPr>
-          <w:rFonts w:hint="default"/>
-        </w:rPr>
-      </w:pPr>
-    </w:p>
-    <w:p>
-      <w:pPr>
-        <w:pStyle w:val="35"/>
-        <w:bidi w:val="0"/>
-        <w:rPr>
-          <w:rFonts w:hint="default"/>
-        </w:rPr>
-      </w:pPr>
-    </w:p>
-    <w:p>
-      <w:pPr>
-        <w:pStyle w:val="35"/>
-        <w:bidi w:val="0"/>
+        <w:ind w:left="0" w:leftChars="0" w:firstLine="0" w:firstLineChars="0"/>
         <w:rPr>
           <w:rFonts w:hint="default"/>
         </w:rPr>
@@ -14411,6 +14374,7 @@
       <w:pPr>
         <w:pStyle w:val="35"/>
         <w:numPr>
+          <w:ilvl w:val="0"/>
           <w:numId w:val="0"/>
         </w:numPr>
         <w:bidi w:val="0"/>
@@ -14422,6 +14386,7 @@
       <w:pPr>
         <w:pStyle w:val="35"/>
         <w:numPr>
+          <w:ilvl w:val="0"/>
           <w:numId w:val="0"/>
         </w:numPr>
         <w:bidi w:val="0"/>
@@ -14433,6 +14398,7 @@
       <w:pPr>
         <w:pStyle w:val="35"/>
         <w:numPr>
+          <w:ilvl w:val="0"/>
           <w:numId w:val="0"/>
         </w:numPr>
         <w:bidi w:val="0"/>
@@ -14494,20 +14460,16 @@
         </w:numPr>
         <w:bidi w:val="0"/>
         <w:ind w:left="1680" w:leftChars="0" w:hanging="420" w:firstLineChars="0"/>
+        <w:rPr>
+          <w:rFonts w:hint="default"/>
+          <w:lang w:val="en-US" w:eastAsia="zh-CN"/>
+        </w:rPr>
       </w:pPr>
       <w:r>
         <w:t>Đưa image lên Docker Hub hoặc deploy trực tiếp bằng Railway/VPS.</w:t>
       </w:r>
-    </w:p>
-    <w:p>
-      <w:pPr>
-        <w:pStyle w:val="35"/>
-        <w:bidi w:val="0"/>
-        <w:rPr>
-          <w:rFonts w:hint="default"/>
-          <w:lang w:val="en-US" w:eastAsia="zh-CN"/>
-        </w:rPr>
-      </w:pPr>
+      <w:bookmarkStart w:id="58" w:name="_GoBack"/>
+      <w:bookmarkEnd w:id="58"/>
     </w:p>
     <w:p>
       <w:pPr>
@@ -14864,6 +14826,7 @@
     </w:p>
     <w:tbl>
       <w:tblPr>
+        <w:tblStyle w:val="12"/>
         <w:tblW w:w="0" w:type="auto"/>
         <w:tblCellSpacing w:w="15" w:type="dxa"/>
         <w:tblInd w:w="0" w:type="dxa"/>
@@ -14875,7 +14838,7 @@
           <w:insideH w:val="single" w:color="auto" w:sz="4" w:space="0"/>
           <w:insideV w:val="single" w:color="auto" w:sz="4" w:space="0"/>
         </w:tblBorders>
-        <w:shd w:val="clear"/>
+        <w:shd w:val="clear" w:color="auto" w:fill="auto"/>
         <w:tblLayout w:type="fixed"/>
         <w:tblCellMar>
           <w:top w:w="15" w:type="dxa"/>
@@ -14900,6 +14863,7 @@
             <w:insideH w:val="single" w:color="auto" w:sz="4" w:space="0"/>
             <w:insideV w:val="single" w:color="auto" w:sz="4" w:space="0"/>
           </w:tblBorders>
+          <w:shd w:val="clear" w:color="auto" w:fill="auto"/>
           <w:tblCellMar>
             <w:top w:w="15" w:type="dxa"/>
             <w:left w:w="15" w:type="dxa"/>
@@ -14918,7 +14882,7 @@
               <w:tl2br w:val="nil"/>
               <w:tr2bl w:val="nil"/>
             </w:tcBorders>
-            <w:shd w:val="clear"/>
+            <w:shd w:val="clear" w:color="auto" w:fill="auto"/>
             <w:vAlign w:val="center"/>
           </w:tcPr>
           <w:p>
@@ -14949,7 +14913,7 @@
               <w:tl2br w:val="nil"/>
               <w:tr2bl w:val="nil"/>
             </w:tcBorders>
-            <w:shd w:val="clear"/>
+            <w:shd w:val="clear" w:color="auto" w:fill="auto"/>
             <w:vAlign w:val="center"/>
           </w:tcPr>
           <w:p>
@@ -14980,7 +14944,7 @@
               <w:tl2br w:val="nil"/>
               <w:tr2bl w:val="nil"/>
             </w:tcBorders>
-            <w:shd w:val="clear"/>
+            <w:shd w:val="clear" w:color="auto" w:fill="auto"/>
             <w:vAlign w:val="center"/>
           </w:tcPr>
           <w:p>
@@ -15011,7 +14975,7 @@
               <w:tl2br w:val="nil"/>
               <w:tr2bl w:val="nil"/>
             </w:tcBorders>
-            <w:shd w:val="clear"/>
+            <w:shd w:val="clear" w:color="auto" w:fill="auto"/>
             <w:vAlign w:val="center"/>
           </w:tcPr>
           <w:p>
@@ -15045,6 +15009,7 @@
             <w:insideH w:val="single" w:color="auto" w:sz="4" w:space="0"/>
             <w:insideV w:val="single" w:color="auto" w:sz="4" w:space="0"/>
           </w:tblBorders>
+          <w:shd w:val="clear" w:color="auto" w:fill="auto"/>
           <w:tblCellMar>
             <w:top w:w="15" w:type="dxa"/>
             <w:left w:w="15" w:type="dxa"/>
@@ -15062,7 +15027,7 @@
               <w:tl2br w:val="nil"/>
               <w:tr2bl w:val="nil"/>
             </w:tcBorders>
-            <w:shd w:val="clear"/>
+            <w:shd w:val="clear" w:color="auto" w:fill="auto"/>
             <w:vAlign w:val="center"/>
           </w:tcPr>
           <w:p>
@@ -15093,7 +15058,7 @@
               <w:tl2br w:val="nil"/>
               <w:tr2bl w:val="nil"/>
             </w:tcBorders>
-            <w:shd w:val="clear"/>
+            <w:shd w:val="clear" w:color="auto" w:fill="auto"/>
             <w:vAlign w:val="center"/>
           </w:tcPr>
           <w:p>
@@ -15118,7 +15083,7 @@
               <w:tl2br w:val="nil"/>
               <w:tr2bl w:val="nil"/>
             </w:tcBorders>
-            <w:shd w:val="clear"/>
+            <w:shd w:val="clear" w:color="auto" w:fill="auto"/>
             <w:vAlign w:val="center"/>
           </w:tcPr>
           <w:p>
@@ -15143,7 +15108,7 @@
               <w:tl2br w:val="nil"/>
               <w:tr2bl w:val="nil"/>
             </w:tcBorders>
-            <w:shd w:val="clear"/>
+            <w:shd w:val="clear" w:color="auto" w:fill="auto"/>
             <w:vAlign w:val="center"/>
           </w:tcPr>
           <w:p>
@@ -15171,6 +15136,7 @@
             <w:insideH w:val="single" w:color="auto" w:sz="4" w:space="0"/>
             <w:insideV w:val="single" w:color="auto" w:sz="4" w:space="0"/>
           </w:tblBorders>
+          <w:shd w:val="clear" w:color="auto" w:fill="auto"/>
           <w:tblCellMar>
             <w:top w:w="15" w:type="dxa"/>
             <w:left w:w="15" w:type="dxa"/>
@@ -15188,7 +15154,7 @@
               <w:tl2br w:val="nil"/>
               <w:tr2bl w:val="nil"/>
             </w:tcBorders>
-            <w:shd w:val="clear"/>
+            <w:shd w:val="clear" w:color="auto" w:fill="auto"/>
             <w:vAlign w:val="center"/>
           </w:tcPr>
           <w:p>
@@ -15219,7 +15185,7 @@
               <w:tl2br w:val="nil"/>
               <w:tr2bl w:val="nil"/>
             </w:tcBorders>
-            <w:shd w:val="clear"/>
+            <w:shd w:val="clear" w:color="auto" w:fill="auto"/>
             <w:vAlign w:val="center"/>
           </w:tcPr>
           <w:p>
@@ -15244,7 +15210,7 @@
               <w:tl2br w:val="nil"/>
               <w:tr2bl w:val="nil"/>
             </w:tcBorders>
-            <w:shd w:val="clear"/>
+            <w:shd w:val="clear" w:color="auto" w:fill="auto"/>
             <w:vAlign w:val="center"/>
           </w:tcPr>
           <w:p>
@@ -15268,7 +15234,7 @@
               <w:tl2br w:val="nil"/>
               <w:tr2bl w:val="nil"/>
             </w:tcBorders>
-            <w:shd w:val="clear"/>
+            <w:shd w:val="clear" w:color="auto" w:fill="auto"/>
             <w:vAlign w:val="center"/>
           </w:tcPr>
           <w:p>
@@ -15296,6 +15262,7 @@
             <w:insideH w:val="single" w:color="auto" w:sz="4" w:space="0"/>
             <w:insideV w:val="single" w:color="auto" w:sz="4" w:space="0"/>
           </w:tblBorders>
+          <w:shd w:val="clear" w:color="auto" w:fill="auto"/>
           <w:tblCellMar>
             <w:top w:w="15" w:type="dxa"/>
             <w:left w:w="15" w:type="dxa"/>
@@ -15313,7 +15280,7 @@
               <w:tl2br w:val="nil"/>
               <w:tr2bl w:val="nil"/>
             </w:tcBorders>
-            <w:shd w:val="clear"/>
+            <w:shd w:val="clear" w:color="auto" w:fill="auto"/>
             <w:vAlign w:val="center"/>
           </w:tcPr>
           <w:p>
@@ -15344,7 +15311,7 @@
               <w:tl2br w:val="nil"/>
               <w:tr2bl w:val="nil"/>
             </w:tcBorders>
-            <w:shd w:val="clear"/>
+            <w:shd w:val="clear" w:color="auto" w:fill="auto"/>
             <w:vAlign w:val="center"/>
           </w:tcPr>
           <w:p>
@@ -15369,7 +15336,7 @@
               <w:tl2br w:val="nil"/>
               <w:tr2bl w:val="nil"/>
             </w:tcBorders>
-            <w:shd w:val="clear"/>
+            <w:shd w:val="clear" w:color="auto" w:fill="auto"/>
             <w:vAlign w:val="center"/>
           </w:tcPr>
           <w:p>
@@ -15393,7 +15360,7 @@
               <w:tl2br w:val="nil"/>
               <w:tr2bl w:val="nil"/>
             </w:tcBorders>
-            <w:shd w:val="clear"/>
+            <w:shd w:val="clear" w:color="auto" w:fill="auto"/>
             <w:vAlign w:val="center"/>
           </w:tcPr>
           <w:p>
@@ -15421,6 +15388,7 @@
             <w:insideH w:val="single" w:color="auto" w:sz="4" w:space="0"/>
             <w:insideV w:val="single" w:color="auto" w:sz="4" w:space="0"/>
           </w:tblBorders>
+          <w:shd w:val="clear" w:color="auto" w:fill="auto"/>
           <w:tblCellMar>
             <w:top w:w="15" w:type="dxa"/>
             <w:left w:w="15" w:type="dxa"/>
@@ -15438,7 +15406,7 @@
               <w:tl2br w:val="nil"/>
               <w:tr2bl w:val="nil"/>
             </w:tcBorders>
-            <w:shd w:val="clear"/>
+            <w:shd w:val="clear" w:color="auto" w:fill="auto"/>
             <w:vAlign w:val="center"/>
           </w:tcPr>
           <w:p>
@@ -15469,7 +15437,7 @@
               <w:tl2br w:val="nil"/>
               <w:tr2bl w:val="nil"/>
             </w:tcBorders>
-            <w:shd w:val="clear"/>
+            <w:shd w:val="clear" w:color="auto" w:fill="auto"/>
             <w:vAlign w:val="center"/>
           </w:tcPr>
           <w:p>
@@ -15494,7 +15462,7 @@
               <w:tl2br w:val="nil"/>
               <w:tr2bl w:val="nil"/>
             </w:tcBorders>
-            <w:shd w:val="clear"/>
+            <w:shd w:val="clear" w:color="auto" w:fill="auto"/>
             <w:vAlign w:val="center"/>
           </w:tcPr>
           <w:p>
@@ -15518,7 +15486,7 @@
               <w:tl2br w:val="nil"/>
               <w:tr2bl w:val="nil"/>
             </w:tcBorders>
-            <w:shd w:val="clear"/>
+            <w:shd w:val="clear" w:color="auto" w:fill="auto"/>
             <w:vAlign w:val="center"/>
           </w:tcPr>
           <w:p>
@@ -15546,6 +15514,7 @@
             <w:insideH w:val="single" w:color="auto" w:sz="4" w:space="0"/>
             <w:insideV w:val="single" w:color="auto" w:sz="4" w:space="0"/>
           </w:tblBorders>
+          <w:shd w:val="clear" w:color="auto" w:fill="auto"/>
           <w:tblCellMar>
             <w:top w:w="15" w:type="dxa"/>
             <w:left w:w="15" w:type="dxa"/>
@@ -15564,7 +15533,7 @@
               <w:tl2br w:val="nil"/>
               <w:tr2bl w:val="nil"/>
             </w:tcBorders>
-            <w:shd w:val="clear"/>
+            <w:shd w:val="clear" w:color="auto" w:fill="auto"/>
             <w:vAlign w:val="center"/>
           </w:tcPr>
           <w:p>
@@ -15595,7 +15564,7 @@
               <w:tl2br w:val="nil"/>
               <w:tr2bl w:val="nil"/>
             </w:tcBorders>
-            <w:shd w:val="clear"/>
+            <w:shd w:val="clear" w:color="auto" w:fill="auto"/>
             <w:vAlign w:val="center"/>
           </w:tcPr>
           <w:p>
@@ -15620,7 +15589,7 @@
               <w:tl2br w:val="nil"/>
               <w:tr2bl w:val="nil"/>
             </w:tcBorders>
-            <w:shd w:val="clear"/>
+            <w:shd w:val="clear" w:color="auto" w:fill="auto"/>
             <w:vAlign w:val="center"/>
           </w:tcPr>
           <w:p>
@@ -15644,7 +15613,7 @@
               <w:tl2br w:val="nil"/>
               <w:tr2bl w:val="nil"/>
             </w:tcBorders>
-            <w:shd w:val="clear"/>
+            <w:shd w:val="clear" w:color="auto" w:fill="auto"/>
             <w:vAlign w:val="center"/>
           </w:tcPr>
           <w:p>
@@ -15673,7 +15642,7 @@
             <w:insideH w:val="single" w:color="auto" w:sz="4" w:space="0"/>
             <w:insideV w:val="single" w:color="auto" w:sz="4" w:space="0"/>
           </w:tblBorders>
-          <w:shd w:val="clear"/>
+          <w:shd w:val="clear" w:color="auto" w:fill="auto"/>
           <w:tblCellMar>
             <w:top w:w="15" w:type="dxa"/>
             <w:left w:w="15" w:type="dxa"/>
@@ -15691,7 +15660,7 @@
               <w:tl2br w:val="nil"/>
               <w:tr2bl w:val="nil"/>
             </w:tcBorders>
-            <w:shd w:val="clear"/>
+            <w:shd w:val="clear" w:color="auto" w:fill="auto"/>
             <w:vAlign w:val="center"/>
           </w:tcPr>
           <w:p>
@@ -15722,7 +15691,7 @@
               <w:tl2br w:val="nil"/>
               <w:tr2bl w:val="nil"/>
             </w:tcBorders>
-            <w:shd w:val="clear"/>
+            <w:shd w:val="clear" w:color="auto" w:fill="auto"/>
             <w:vAlign w:val="center"/>
           </w:tcPr>
           <w:p>
@@ -15747,7 +15716,7 @@
               <w:tl2br w:val="nil"/>
               <w:tr2bl w:val="nil"/>
             </w:tcBorders>
-            <w:shd w:val="clear"/>
+            <w:shd w:val="clear" w:color="auto" w:fill="auto"/>
             <w:vAlign w:val="center"/>
           </w:tcPr>
           <w:p>
@@ -15771,7 +15740,7 @@
               <w:tl2br w:val="nil"/>
               <w:tr2bl w:val="nil"/>
             </w:tcBorders>
-            <w:shd w:val="clear"/>
+            <w:shd w:val="clear" w:color="auto" w:fill="auto"/>
             <w:vAlign w:val="center"/>
           </w:tcPr>
           <w:p>
@@ -15800,6 +15769,7 @@
             <w:insideH w:val="single" w:color="auto" w:sz="4" w:space="0"/>
             <w:insideV w:val="single" w:color="auto" w:sz="4" w:space="0"/>
           </w:tblBorders>
+          <w:shd w:val="clear" w:color="auto" w:fill="auto"/>
           <w:tblCellMar>
             <w:top w:w="15" w:type="dxa"/>
             <w:left w:w="15" w:type="dxa"/>
@@ -15817,7 +15787,7 @@
               <w:tl2br w:val="nil"/>
               <w:tr2bl w:val="nil"/>
             </w:tcBorders>
-            <w:shd w:val="clear"/>
+            <w:shd w:val="clear" w:color="auto" w:fill="auto"/>
             <w:vAlign w:val="center"/>
           </w:tcPr>
           <w:p>
@@ -15848,7 +15818,7 @@
               <w:tl2br w:val="nil"/>
               <w:tr2bl w:val="nil"/>
             </w:tcBorders>
-            <w:shd w:val="clear"/>
+            <w:shd w:val="clear" w:color="auto" w:fill="auto"/>
             <w:vAlign w:val="center"/>
           </w:tcPr>
           <w:p>
@@ -15873,7 +15843,7 @@
               <w:tl2br w:val="nil"/>
               <w:tr2bl w:val="nil"/>
             </w:tcBorders>
-            <w:shd w:val="clear"/>
+            <w:shd w:val="clear" w:color="auto" w:fill="auto"/>
             <w:vAlign w:val="center"/>
           </w:tcPr>
           <w:p>
@@ -15897,7 +15867,7 @@
               <w:tl2br w:val="nil"/>
               <w:tr2bl w:val="nil"/>
             </w:tcBorders>
-            <w:shd w:val="clear"/>
+            <w:shd w:val="clear" w:color="auto" w:fill="auto"/>
             <w:vAlign w:val="center"/>
           </w:tcPr>
           <w:p>
@@ -15925,6 +15895,7 @@
             <w:insideH w:val="single" w:color="auto" w:sz="4" w:space="0"/>
             <w:insideV w:val="single" w:color="auto" w:sz="4" w:space="0"/>
           </w:tblBorders>
+          <w:shd w:val="clear" w:color="auto" w:fill="auto"/>
           <w:tblCellMar>
             <w:top w:w="15" w:type="dxa"/>
             <w:left w:w="15" w:type="dxa"/>
@@ -15942,7 +15913,7 @@
               <w:tl2br w:val="nil"/>
               <w:tr2bl w:val="nil"/>
             </w:tcBorders>
-            <w:shd w:val="clear"/>
+            <w:shd w:val="clear" w:color="auto" w:fill="auto"/>
             <w:vAlign w:val="center"/>
           </w:tcPr>
           <w:p>
@@ -15973,7 +15944,7 @@
               <w:tl2br w:val="nil"/>
               <w:tr2bl w:val="nil"/>
             </w:tcBorders>
-            <w:shd w:val="clear"/>
+            <w:shd w:val="clear" w:color="auto" w:fill="auto"/>
             <w:vAlign w:val="center"/>
           </w:tcPr>
           <w:p>
@@ -15998,7 +15969,7 @@
               <w:tl2br w:val="nil"/>
               <w:tr2bl w:val="nil"/>
             </w:tcBorders>
-            <w:shd w:val="clear"/>
+            <w:shd w:val="clear" w:color="auto" w:fill="auto"/>
             <w:vAlign w:val="center"/>
           </w:tcPr>
           <w:p>
@@ -16022,7 +15993,7 @@
               <w:tl2br w:val="nil"/>
               <w:tr2bl w:val="nil"/>
             </w:tcBorders>
-            <w:shd w:val="clear"/>
+            <w:shd w:val="clear" w:color="auto" w:fill="auto"/>
             <w:vAlign w:val="center"/>
           </w:tcPr>
           <w:p>
@@ -16050,6 +16021,7 @@
             <w:insideH w:val="single" w:color="auto" w:sz="4" w:space="0"/>
             <w:insideV w:val="single" w:color="auto" w:sz="4" w:space="0"/>
           </w:tblBorders>
+          <w:shd w:val="clear" w:color="auto" w:fill="auto"/>
           <w:tblCellMar>
             <w:top w:w="15" w:type="dxa"/>
             <w:left w:w="15" w:type="dxa"/>
@@ -16067,7 +16039,7 @@
               <w:tl2br w:val="nil"/>
               <w:tr2bl w:val="nil"/>
             </w:tcBorders>
-            <w:shd w:val="clear"/>
+            <w:shd w:val="clear" w:color="auto" w:fill="auto"/>
             <w:vAlign w:val="center"/>
           </w:tcPr>
           <w:p>
@@ -16098,7 +16070,7 @@
               <w:tl2br w:val="nil"/>
               <w:tr2bl w:val="nil"/>
             </w:tcBorders>
-            <w:shd w:val="clear"/>
+            <w:shd w:val="clear" w:color="auto" w:fill="auto"/>
             <w:vAlign w:val="center"/>
           </w:tcPr>
           <w:p>
@@ -16123,7 +16095,7 @@
               <w:tl2br w:val="nil"/>
               <w:tr2bl w:val="nil"/>
             </w:tcBorders>
-            <w:shd w:val="clear"/>
+            <w:shd w:val="clear" w:color="auto" w:fill="auto"/>
             <w:vAlign w:val="center"/>
           </w:tcPr>
           <w:p>
@@ -16147,7 +16119,7 @@
               <w:tl2br w:val="nil"/>
               <w:tr2bl w:val="nil"/>
             </w:tcBorders>
-            <w:shd w:val="clear"/>
+            <w:shd w:val="clear" w:color="auto" w:fill="auto"/>
             <w:vAlign w:val="center"/>
           </w:tcPr>
           <w:p>
@@ -16174,6 +16146,7 @@
             <w:insideH w:val="single" w:color="auto" w:sz="4" w:space="0"/>
             <w:insideV w:val="single" w:color="auto" w:sz="4" w:space="0"/>
           </w:tblBorders>
+          <w:shd w:val="clear" w:color="auto" w:fill="auto"/>
           <w:tblCellMar>
             <w:top w:w="15" w:type="dxa"/>
             <w:left w:w="15" w:type="dxa"/>
@@ -16191,7 +16164,7 @@
               <w:tl2br w:val="nil"/>
               <w:tr2bl w:val="nil"/>
             </w:tcBorders>
-            <w:shd w:val="clear"/>
+            <w:shd w:val="clear" w:color="auto" w:fill="auto"/>
             <w:vAlign w:val="center"/>
           </w:tcPr>
           <w:p>
@@ -16222,7 +16195,7 @@
               <w:tl2br w:val="nil"/>
               <w:tr2bl w:val="nil"/>
             </w:tcBorders>
-            <w:shd w:val="clear"/>
+            <w:shd w:val="clear" w:color="auto" w:fill="auto"/>
             <w:vAlign w:val="center"/>
           </w:tcPr>
           <w:p>
@@ -16247,7 +16220,7 @@
               <w:tl2br w:val="nil"/>
               <w:tr2bl w:val="nil"/>
             </w:tcBorders>
-            <w:shd w:val="clear"/>
+            <w:shd w:val="clear" w:color="auto" w:fill="auto"/>
             <w:vAlign w:val="center"/>
           </w:tcPr>
           <w:p>
@@ -16271,7 +16244,7 @@
               <w:tl2br w:val="nil"/>
               <w:tr2bl w:val="nil"/>
             </w:tcBorders>
-            <w:shd w:val="clear"/>
+            <w:shd w:val="clear" w:color="auto" w:fill="auto"/>
             <w:vAlign w:val="center"/>
           </w:tcPr>
           <w:p>
@@ -17125,6 +17098,7 @@
       <w:pPr>
         <w:pStyle w:val="35"/>
         <w:numPr>
+          <w:ilvl w:val="0"/>
           <w:numId w:val="0"/>
         </w:numPr>
         <w:bidi w:val="0"/>
@@ -17322,6 +17296,7 @@
       <w:pPr>
         <w:pStyle w:val="35"/>
         <w:numPr>
+          <w:ilvl w:val="0"/>
           <w:numId w:val="0"/>
         </w:numPr>
         <w:bidi w:val="0"/>
@@ -17420,6 +17395,7 @@
       <w:pPr>
         <w:pStyle w:val="35"/>
         <w:numPr>
+          <w:ilvl w:val="0"/>
           <w:numId w:val="0"/>
         </w:numPr>
         <w:bidi w:val="0"/>
@@ -17443,6 +17419,7 @@
       <w:pPr>
         <w:pStyle w:val="35"/>
         <w:numPr>
+          <w:ilvl w:val="0"/>
           <w:numId w:val="0"/>
         </w:numPr>
         <w:bidi w:val="0"/>
@@ -17458,6 +17435,7 @@
       <w:pPr>
         <w:pStyle w:val="35"/>
         <w:numPr>
+          <w:ilvl w:val="0"/>
           <w:numId w:val="0"/>
         </w:numPr>
         <w:bidi w:val="0"/>
@@ -17556,6 +17534,7 @@
       <w:pPr>
         <w:pStyle w:val="35"/>
         <w:numPr>
+          <w:ilvl w:val="0"/>
           <w:numId w:val="0"/>
         </w:numPr>
         <w:bidi w:val="0"/>
@@ -17575,6 +17554,7 @@
       <w:pPr>
         <w:pStyle w:val="35"/>
         <w:numPr>
+          <w:ilvl w:val="0"/>
           <w:numId w:val="0"/>
         </w:numPr>
         <w:bidi w:val="0"/>
@@ -17588,6 +17568,7 @@
       <w:pPr>
         <w:pStyle w:val="35"/>
         <w:numPr>
+          <w:ilvl w:val="0"/>
           <w:numId w:val="0"/>
         </w:numPr>
         <w:bidi w:val="0"/>
@@ -17686,6 +17667,7 @@
       <w:pPr>
         <w:pStyle w:val="35"/>
         <w:numPr>
+          <w:ilvl w:val="0"/>
           <w:numId w:val="0"/>
         </w:numPr>
         <w:bidi w:val="0"/>
@@ -17702,6 +17684,7 @@
       <w:pPr>
         <w:pStyle w:val="35"/>
         <w:numPr>
+          <w:ilvl w:val="0"/>
           <w:numId w:val="0"/>
         </w:numPr>
         <w:bidi w:val="0"/>
@@ -17716,6 +17699,7 @@
       <w:pPr>
         <w:pStyle w:val="35"/>
         <w:numPr>
+          <w:ilvl w:val="0"/>
           <w:numId w:val="0"/>
         </w:numPr>
         <w:bidi w:val="0"/>
@@ -17730,6 +17714,7 @@
       <w:pPr>
         <w:pStyle w:val="35"/>
         <w:numPr>
+          <w:ilvl w:val="0"/>
           <w:numId w:val="0"/>
         </w:numPr>
         <w:bidi w:val="0"/>
@@ -19676,8 +19661,8 @@
     <w:lsdException w:qFormat="1" w:unhideWhenUsed="0" w:uiPriority="60" w:semiHidden="0" w:name="Light Shading"/>
     <w:lsdException w:qFormat="1" w:unhideWhenUsed="0" w:uiPriority="61" w:semiHidden="0" w:name="Light List"/>
     <w:lsdException w:qFormat="1" w:unhideWhenUsed="0" w:uiPriority="62" w:semiHidden="0" w:name="Light Grid"/>
-    <w:lsdException w:unhideWhenUsed="0" w:uiPriority="63" w:semiHidden="0" w:name="Medium Shading 1"/>
-    <w:lsdException w:unhideWhenUsed="0" w:uiPriority="64" w:semiHidden="0" w:name="Medium Shading 2"/>
+    <w:lsdException w:qFormat="1" w:unhideWhenUsed="0" w:uiPriority="63" w:semiHidden="0" w:name="Medium Shading 1"/>
+    <w:lsdException w:qFormat="1" w:unhideWhenUsed="0" w:uiPriority="64" w:semiHidden="0" w:name="Medium Shading 2"/>
     <w:lsdException w:unhideWhenUsed="0" w:uiPriority="65" w:semiHidden="0" w:name="Medium List 1"/>
     <w:lsdException w:unhideWhenUsed="0" w:uiPriority="66" w:semiHidden="0" w:name="Medium List 2"/>
     <w:lsdException w:unhideWhenUsed="0" w:uiPriority="67" w:semiHidden="0" w:name="Medium Grid 1"/>
@@ -19691,7 +19676,7 @@
     <w:lsdException w:qFormat="1" w:unhideWhenUsed="0" w:uiPriority="61" w:semiHidden="0" w:name="Light List Accent 1"/>
     <w:lsdException w:qFormat="1" w:unhideWhenUsed="0" w:uiPriority="62" w:semiHidden="0" w:name="Light Grid Accent 1"/>
     <w:lsdException w:qFormat="1" w:unhideWhenUsed="0" w:uiPriority="63" w:semiHidden="0" w:name="Medium Shading 1 Accent 1"/>
-    <w:lsdException w:unhideWhenUsed="0" w:uiPriority="64" w:semiHidden="0" w:name="Medium Shading 2 Accent 1"/>
+    <w:lsdException w:qFormat="1" w:unhideWhenUsed="0" w:uiPriority="64" w:semiHidden="0" w:name="Medium Shading 2 Accent 1"/>
     <w:lsdException w:unhideWhenUsed="0" w:uiPriority="65" w:semiHidden="0" w:name="Medium List 1 Accent 1"/>
     <w:lsdException w:unhideWhenUsed="0" w:uiPriority="66" w:semiHidden="0" w:name="Medium List 2 Accent 1"/>
     <w:lsdException w:unhideWhenUsed="0" w:uiPriority="67" w:semiHidden="0" w:name="Medium Grid 1 Accent 1"/>
@@ -19704,8 +19689,8 @@
     <w:lsdException w:qFormat="1" w:unhideWhenUsed="0" w:uiPriority="60" w:semiHidden="0" w:name="Light Shading Accent 2"/>
     <w:lsdException w:qFormat="1" w:unhideWhenUsed="0" w:uiPriority="61" w:semiHidden="0" w:name="Light List Accent 2"/>
     <w:lsdException w:qFormat="1" w:unhideWhenUsed="0" w:uiPriority="62" w:semiHidden="0" w:name="Light Grid Accent 2"/>
-    <w:lsdException w:unhideWhenUsed="0" w:uiPriority="63" w:semiHidden="0" w:name="Medium Shading 1 Accent 2"/>
-    <w:lsdException w:unhideWhenUsed="0" w:uiPriority="64" w:semiHidden="0" w:name="Medium Shading 2 Accent 2"/>
+    <w:lsdException w:qFormat="1" w:unhideWhenUsed="0" w:uiPriority="63" w:semiHidden="0" w:name="Medium Shading 1 Accent 2"/>
+    <w:lsdException w:qFormat="1" w:unhideWhenUsed="0" w:uiPriority="64" w:semiHidden="0" w:name="Medium Shading 2 Accent 2"/>
     <w:lsdException w:unhideWhenUsed="0" w:uiPriority="65" w:semiHidden="0" w:name="Medium List 1 Accent 2"/>
     <w:lsdException w:unhideWhenUsed="0" w:uiPriority="66" w:semiHidden="0" w:name="Medium List 2 Accent 2"/>
     <w:lsdException w:unhideWhenUsed="0" w:uiPriority="67" w:semiHidden="0" w:name="Medium Grid 1 Accent 2"/>
@@ -19719,7 +19704,7 @@
     <w:lsdException w:qFormat="1" w:unhideWhenUsed="0" w:uiPriority="61" w:semiHidden="0" w:name="Light List Accent 3"/>
     <w:lsdException w:qFormat="1" w:unhideWhenUsed="0" w:uiPriority="62" w:semiHidden="0" w:name="Light Grid Accent 3"/>
     <w:lsdException w:qFormat="1" w:unhideWhenUsed="0" w:uiPriority="63" w:semiHidden="0" w:name="Medium Shading 1 Accent 3"/>
-    <w:lsdException w:unhideWhenUsed="0" w:uiPriority="64" w:semiHidden="0" w:name="Medium Shading 2 Accent 3"/>
+    <w:lsdException w:qFormat="1" w:unhideWhenUsed="0" w:uiPriority="64" w:semiHidden="0" w:name="Medium Shading 2 Accent 3"/>
     <w:lsdException w:unhideWhenUsed="0" w:uiPriority="65" w:semiHidden="0" w:name="Medium List 1 Accent 3"/>
     <w:lsdException w:unhideWhenUsed="0" w:uiPriority="66" w:semiHidden="0" w:name="Medium List 2 Accent 3"/>
     <w:lsdException w:unhideWhenUsed="0" w:uiPriority="67" w:semiHidden="0" w:name="Medium Grid 1 Accent 3"/>
@@ -19732,8 +19717,8 @@
     <w:lsdException w:qFormat="1" w:unhideWhenUsed="0" w:uiPriority="60" w:semiHidden="0" w:name="Light Shading Accent 4"/>
     <w:lsdException w:qFormat="1" w:unhideWhenUsed="0" w:uiPriority="61" w:semiHidden="0" w:name="Light List Accent 4"/>
     <w:lsdException w:qFormat="1" w:unhideWhenUsed="0" w:uiPriority="62" w:semiHidden="0" w:name="Light Grid Accent 4"/>
-    <w:lsdException w:unhideWhenUsed="0" w:uiPriority="63" w:semiHidden="0" w:name="Medium Shading 1 Accent 4"/>
-    <w:lsdException w:unhideWhenUsed="0" w:uiPriority="64" w:semiHidden="0" w:name="Medium Shading 2 Accent 4"/>
+    <w:lsdException w:qFormat="1" w:unhideWhenUsed="0" w:uiPriority="63" w:semiHidden="0" w:name="Medium Shading 1 Accent 4"/>
+    <w:lsdException w:qFormat="1" w:unhideWhenUsed="0" w:uiPriority="64" w:semiHidden="0" w:name="Medium Shading 2 Accent 4"/>
     <w:lsdException w:unhideWhenUsed="0" w:uiPriority="65" w:semiHidden="0" w:name="Medium List 1 Accent 4"/>
     <w:lsdException w:unhideWhenUsed="0" w:uiPriority="66" w:semiHidden="0" w:name="Medium List 2 Accent 4"/>
     <w:lsdException w:unhideWhenUsed="0" w:uiPriority="67" w:semiHidden="0" w:name="Medium Grid 1 Accent 4"/>
@@ -19746,7 +19731,7 @@
     <w:lsdException w:qFormat="1" w:unhideWhenUsed="0" w:uiPriority="60" w:semiHidden="0" w:name="Light Shading Accent 5"/>
     <w:lsdException w:qFormat="1" w:unhideWhenUsed="0" w:uiPriority="61" w:semiHidden="0" w:name="Light List Accent 5"/>
     <w:lsdException w:qFormat="1" w:unhideWhenUsed="0" w:uiPriority="62" w:semiHidden="0" w:name="Light Grid Accent 5"/>
-    <w:lsdException w:unhideWhenUsed="0" w:uiPriority="63" w:semiHidden="0" w:name="Medium Shading 1 Accent 5"/>
+    <w:lsdException w:qFormat="1" w:unhideWhenUsed="0" w:uiPriority="63" w:semiHidden="0" w:name="Medium Shading 1 Accent 5"/>
     <w:lsdException w:unhideWhenUsed="0" w:uiPriority="64" w:semiHidden="0" w:name="Medium Shading 2 Accent 5"/>
     <w:lsdException w:unhideWhenUsed="0" w:uiPriority="65" w:semiHidden="0" w:name="Medium List 1 Accent 5"/>
     <w:lsdException w:unhideWhenUsed="0" w:uiPriority="66" w:semiHidden="0" w:name="Medium List 2 Accent 5"/>
@@ -19760,7 +19745,7 @@
     <w:lsdException w:qFormat="1" w:unhideWhenUsed="0" w:uiPriority="60" w:semiHidden="0" w:name="Light Shading Accent 6"/>
     <w:lsdException w:qFormat="1" w:unhideWhenUsed="0" w:uiPriority="61" w:semiHidden="0" w:name="Light List Accent 6"/>
     <w:lsdException w:qFormat="1" w:unhideWhenUsed="0" w:uiPriority="62" w:semiHidden="0" w:name="Light Grid Accent 6"/>
-    <w:lsdException w:unhideWhenUsed="0" w:uiPriority="63" w:semiHidden="0" w:name="Medium Shading 1 Accent 6"/>
+    <w:lsdException w:qFormat="1" w:unhideWhenUsed="0" w:uiPriority="63" w:semiHidden="0" w:name="Medium Shading 1 Accent 6"/>
     <w:lsdException w:unhideWhenUsed="0" w:uiPriority="64" w:semiHidden="0" w:name="Medium Shading 2 Accent 6"/>
     <w:lsdException w:unhideWhenUsed="0" w:uiPriority="65" w:semiHidden="0" w:name="Medium List 1 Accent 6"/>
     <w:lsdException w:unhideWhenUsed="0" w:uiPriority="66" w:semiHidden="0" w:name="Medium List 2 Accent 6"/>

</xml_diff>

<commit_message>
cập nhật Postman và Docker
</commit_message>
<xml_diff>
--- a/BaoCaoKTM_NhomTripleCode/BaoCaoKetThucMon_CNPM_DA22TTC.docx
+++ b/BaoCaoKTM_NhomTripleCode/BaoCaoKetThucMon_CNPM_DA22TTC.docx
@@ -3315,8 +3315,8 @@
           <w:iCs w:val="0"/>
         </w:rPr>
       </w:pPr>
-      <w:bookmarkStart w:id="2" w:name="_Toc27274"/>
-      <w:bookmarkStart w:id="3" w:name="_Toc27080"/>
+      <w:bookmarkStart w:id="2" w:name="_Toc27080"/>
+      <w:bookmarkStart w:id="3" w:name="_Toc27274"/>
       <w:r>
         <w:rPr>
           <w:i w:val="0"/>
@@ -7028,14 +7028,14 @@
         <w:pStyle w:val="35"/>
         <w:bidi w:val="0"/>
       </w:pPr>
-      <w:bookmarkStart w:id="10" w:name="_Toc3497"/>
+      <w:bookmarkStart w:id="10" w:name="_Toc31689"/>
       <w:bookmarkStart w:id="11" w:name="_Toc16654"/>
-      <w:bookmarkStart w:id="12" w:name="_Toc10977"/>
-      <w:bookmarkStart w:id="13" w:name="_Toc8637"/>
-      <w:bookmarkStart w:id="14" w:name="_Toc10720"/>
-      <w:bookmarkStart w:id="15" w:name="_Toc15361"/>
-      <w:bookmarkStart w:id="16" w:name="_Toc31689"/>
-      <w:bookmarkStart w:id="17" w:name="_Toc15225"/>
+      <w:bookmarkStart w:id="12" w:name="_Toc15225"/>
+      <w:bookmarkStart w:id="13" w:name="_Toc10720"/>
+      <w:bookmarkStart w:id="14" w:name="_Toc15361"/>
+      <w:bookmarkStart w:id="15" w:name="_Toc8637"/>
+      <w:bookmarkStart w:id="16" w:name="_Toc10977"/>
+      <w:bookmarkStart w:id="17" w:name="_Toc3497"/>
       <w:r>
         <w:t>Đồ án môn học với đề tài “Tìm hiểu về Node.js và xây dựng website nhà hàng Ẩm Thực Phương Nam Trà Vinh” được thực hiện với mục tiêu nghiên cứu nền tảng lập trình backend hiện đại Node.js, đồng thời áp dụng vào việc xây dựng một hệ thống website giới thiệu và quản lý hoạt động của nhà hàng. Trong quá trình thực hiện, nhóm đã tìm hiểu các khái niệm cơ bản về Node.js, Express.js, cũng như cách kết nối cơ sở dữ liệu MySQL để xây dựng một hệ thống có khả năng xử lý yêu cầu nhanh, gọn, hiệu quả. Website gồm các chức năng chính như: hiển thị thực đơn món ăn theo từng loại, đặt bàn trực tuyến, đặt món ăn, quản lý hóa đơn và chi tiết hóa đơn, quản lý danh mục món ăn từ giao diện admin. Giao diện được thiết kế thân thiện, dễ sử dụng, tương thích nhiều thiết bị, sử dụng HTML, CSS</w:t>
       </w:r>
@@ -9729,6 +9729,7 @@
             <w:insideH w:val="single" w:color="auto" w:sz="4" w:space="0"/>
             <w:insideV w:val="single" w:color="auto" w:sz="4" w:space="0"/>
           </w:tblBorders>
+          <w:shd w:val="clear" w:color="auto" w:fill="auto"/>
           <w:tblCellMar>
             <w:top w:w="15" w:type="dxa"/>
             <w:left w:w="15" w:type="dxa"/>
@@ -9900,7 +9901,6 @@
             <w:insideH w:val="single" w:color="auto" w:sz="4" w:space="0"/>
             <w:insideV w:val="single" w:color="auto" w:sz="4" w:space="0"/>
           </w:tblBorders>
-          <w:shd w:val="clear" w:color="auto" w:fill="auto"/>
           <w:tblCellMar>
             <w:top w:w="15" w:type="dxa"/>
             <w:left w:w="15" w:type="dxa"/>
@@ -10076,7 +10076,6 @@
             <w:insideH w:val="single" w:color="auto" w:sz="4" w:space="0"/>
             <w:insideV w:val="single" w:color="auto" w:sz="4" w:space="0"/>
           </w:tblBorders>
-          <w:shd w:val="clear" w:color="auto" w:fill="auto"/>
           <w:tblCellMar>
             <w:top w:w="15" w:type="dxa"/>
             <w:left w:w="15" w:type="dxa"/>
@@ -13815,23 +13814,6 @@
       <w:pPr>
         <w:pStyle w:val="2"/>
         <w:bidi w:val="0"/>
-      </w:pPr>
-      <w:bookmarkStart w:id="40" w:name="_Toc9819"/>
-      <w:r>
-        <w:rPr>
-          <w:lang w:val="en-US" w:eastAsia="zh-CN"/>
-        </w:rPr>
-        <w:t>Triển khai và công nghệ sử dụng</w:t>
-      </w:r>
-      <w:bookmarkEnd w:id="40"/>
-    </w:p>
-    <w:p>
-      <w:pPr>
-        <w:keepNext w:val="0"/>
-        <w:keepLines w:val="0"/>
-        <w:widowControl/>
-        <w:suppressLineNumbers w:val="0"/>
-        <w:jc w:val="left"/>
         <w:rPr>
           <w:rFonts w:hint="default" w:ascii="Arial" w:hAnsi="Arial" w:eastAsia="SimSun" w:cs="Arial"/>
           <w:color w:val="000000"/>
@@ -13841,6 +13823,14 @@
           <w:lang w:val="en-US" w:eastAsia="zh-CN" w:bidi="ar"/>
         </w:rPr>
       </w:pPr>
+      <w:bookmarkStart w:id="40" w:name="_Toc9819"/>
+      <w:r>
+        <w:rPr>
+          <w:lang w:val="en-US" w:eastAsia="zh-CN"/>
+        </w:rPr>
+        <w:t>Triển khai và công nghệ sử dụng</w:t>
+      </w:r>
+      <w:bookmarkEnd w:id="40"/>
     </w:p>
     <w:p>
       <w:pPr>
@@ -14234,14 +14224,8 @@
       <w:r>
         <w:t>Khi code được push lên main, hệ thống sẽ tự động deploy container mới.</w:t>
       </w:r>
-    </w:p>
-    <w:p>
-      <w:pPr>
-        <w:keepNext w:val="0"/>
-        <w:keepLines w:val="0"/>
-        <w:widowControl/>
-        <w:suppressLineNumbers w:val="0"/>
-      </w:pPr>
+      <w:bookmarkStart w:id="58" w:name="_GoBack"/>
+      <w:bookmarkEnd w:id="58"/>
     </w:p>
     <w:p>
       <w:pPr>
@@ -14468,8 +14452,6 @@
       <w:r>
         <w:t>Đưa image lên Docker Hub hoặc deploy trực tiếp bằng Railway/VPS.</w:t>
       </w:r>
-      <w:bookmarkStart w:id="58" w:name="_GoBack"/>
-      <w:bookmarkEnd w:id="58"/>
     </w:p>
     <w:p>
       <w:pPr>
@@ -16810,27 +16792,6 @@
         <w:pStyle w:val="2"/>
         <w:bidi w:val="0"/>
         <w:rPr>
-          <w:rFonts w:hint="default"/>
-          <w:lang w:val="en-US" w:eastAsia="zh-CN"/>
-        </w:rPr>
-      </w:pPr>
-      <w:r>
-        <w:t xml:space="preserve"> </w:t>
-      </w:r>
-      <w:bookmarkStart w:id="50" w:name="_Toc2922"/>
-      <w:r>
-        <w:t>ĐÁNH GIÁ VÀ KẾT LUẬN</w:t>
-      </w:r>
-      <w:bookmarkEnd w:id="50"/>
-    </w:p>
-    <w:p>
-      <w:pPr>
-        <w:keepNext w:val="0"/>
-        <w:keepLines w:val="0"/>
-        <w:widowControl/>
-        <w:suppressLineNumbers w:val="0"/>
-        <w:jc w:val="left"/>
-        <w:rPr>
           <w:rFonts w:hint="default" w:ascii="Arial" w:hAnsi="Arial" w:eastAsia="SimSun" w:cs="Arial"/>
           <w:color w:val="000000"/>
           <w:kern w:val="0"/>
@@ -16839,23 +16800,14 @@
           <w:lang w:val="en-US" w:eastAsia="zh-CN" w:bidi="ar"/>
         </w:rPr>
       </w:pPr>
-    </w:p>
-    <w:p>
-      <w:pPr>
-        <w:keepNext w:val="0"/>
-        <w:keepLines w:val="0"/>
-        <w:widowControl/>
-        <w:suppressLineNumbers w:val="0"/>
-        <w:jc w:val="left"/>
-        <w:rPr>
-          <w:rFonts w:hint="default" w:ascii="Arial" w:hAnsi="Arial" w:eastAsia="SimSun" w:cs="Arial"/>
-          <w:color w:val="000000"/>
-          <w:kern w:val="0"/>
-          <w:sz w:val="22"/>
-          <w:szCs w:val="22"/>
-          <w:lang w:val="en-US" w:eastAsia="zh-CN" w:bidi="ar"/>
-        </w:rPr>
-      </w:pPr>
+      <w:r>
+        <w:t xml:space="preserve"> </w:t>
+      </w:r>
+      <w:bookmarkStart w:id="50" w:name="_Toc2922"/>
+      <w:r>
+        <w:t>ĐÁNH GIÁ VÀ KẾT LUẬN</w:t>
+      </w:r>
+      <w:bookmarkEnd w:id="50"/>
     </w:p>
     <w:p>
       <w:pPr>
@@ -17103,6 +17055,23 @@
         </w:numPr>
         <w:bidi w:val="0"/>
         <w:ind w:left="360" w:leftChars="0"/>
+      </w:pPr>
+    </w:p>
+    <w:p>
+      <w:pPr>
+        <w:keepNext w:val="0"/>
+        <w:keepLines w:val="0"/>
+        <w:widowControl/>
+        <w:suppressLineNumbers w:val="0"/>
+        <w:jc w:val="left"/>
+        <w:rPr>
+          <w:rFonts w:hint="default" w:ascii="Arial" w:hAnsi="Arial" w:eastAsia="SimSun" w:cs="Arial"/>
+          <w:color w:val="000000"/>
+          <w:kern w:val="0"/>
+          <w:sz w:val="22"/>
+          <w:szCs w:val="22"/>
+          <w:lang w:val="en-US" w:eastAsia="zh-CN" w:bidi="ar"/>
+        </w:rPr>
       </w:pPr>
     </w:p>
     <w:p>
@@ -19674,7 +19643,7 @@
     <w:lsdException w:unhideWhenUsed="0" w:uiPriority="73" w:semiHidden="0" w:name="Colorful Grid"/>
     <w:lsdException w:qFormat="1" w:unhideWhenUsed="0" w:uiPriority="60" w:semiHidden="0" w:name="Light Shading Accent 1"/>
     <w:lsdException w:qFormat="1" w:unhideWhenUsed="0" w:uiPriority="61" w:semiHidden="0" w:name="Light List Accent 1"/>
-    <w:lsdException w:qFormat="1" w:unhideWhenUsed="0" w:uiPriority="62" w:semiHidden="0" w:name="Light Grid Accent 1"/>
+    <w:lsdException w:unhideWhenUsed="0" w:uiPriority="62" w:semiHidden="0" w:name="Light Grid Accent 1"/>
     <w:lsdException w:qFormat="1" w:unhideWhenUsed="0" w:uiPriority="63" w:semiHidden="0" w:name="Medium Shading 1 Accent 1"/>
     <w:lsdException w:qFormat="1" w:unhideWhenUsed="0" w:uiPriority="64" w:semiHidden="0" w:name="Medium Shading 2 Accent 1"/>
     <w:lsdException w:unhideWhenUsed="0" w:uiPriority="65" w:semiHidden="0" w:name="Medium List 1 Accent 1"/>
@@ -19687,10 +19656,10 @@
     <w:lsdException w:unhideWhenUsed="0" w:uiPriority="72" w:semiHidden="0" w:name="Colorful List Accent 1"/>
     <w:lsdException w:unhideWhenUsed="0" w:uiPriority="73" w:semiHidden="0" w:name="Colorful Grid Accent 1"/>
     <w:lsdException w:qFormat="1" w:unhideWhenUsed="0" w:uiPriority="60" w:semiHidden="0" w:name="Light Shading Accent 2"/>
-    <w:lsdException w:qFormat="1" w:unhideWhenUsed="0" w:uiPriority="61" w:semiHidden="0" w:name="Light List Accent 2"/>
+    <w:lsdException w:unhideWhenUsed="0" w:uiPriority="61" w:semiHidden="0" w:name="Light List Accent 2"/>
     <w:lsdException w:qFormat="1" w:unhideWhenUsed="0" w:uiPriority="62" w:semiHidden="0" w:name="Light Grid Accent 2"/>
     <w:lsdException w:qFormat="1" w:unhideWhenUsed="0" w:uiPriority="63" w:semiHidden="0" w:name="Medium Shading 1 Accent 2"/>
-    <w:lsdException w:qFormat="1" w:unhideWhenUsed="0" w:uiPriority="64" w:semiHidden="0" w:name="Medium Shading 2 Accent 2"/>
+    <w:lsdException w:unhideWhenUsed="0" w:uiPriority="64" w:semiHidden="0" w:name="Medium Shading 2 Accent 2"/>
     <w:lsdException w:unhideWhenUsed="0" w:uiPriority="65" w:semiHidden="0" w:name="Medium List 1 Accent 2"/>
     <w:lsdException w:unhideWhenUsed="0" w:uiPriority="66" w:semiHidden="0" w:name="Medium List 2 Accent 2"/>
     <w:lsdException w:unhideWhenUsed="0" w:uiPriority="67" w:semiHidden="0" w:name="Medium Grid 1 Accent 2"/>
@@ -19704,7 +19673,7 @@
     <w:lsdException w:qFormat="1" w:unhideWhenUsed="0" w:uiPriority="61" w:semiHidden="0" w:name="Light List Accent 3"/>
     <w:lsdException w:qFormat="1" w:unhideWhenUsed="0" w:uiPriority="62" w:semiHidden="0" w:name="Light Grid Accent 3"/>
     <w:lsdException w:qFormat="1" w:unhideWhenUsed="0" w:uiPriority="63" w:semiHidden="0" w:name="Medium Shading 1 Accent 3"/>
-    <w:lsdException w:qFormat="1" w:unhideWhenUsed="0" w:uiPriority="64" w:semiHidden="0" w:name="Medium Shading 2 Accent 3"/>
+    <w:lsdException w:unhideWhenUsed="0" w:uiPriority="64" w:semiHidden="0" w:name="Medium Shading 2 Accent 3"/>
     <w:lsdException w:unhideWhenUsed="0" w:uiPriority="65" w:semiHidden="0" w:name="Medium List 1 Accent 3"/>
     <w:lsdException w:unhideWhenUsed="0" w:uiPriority="66" w:semiHidden="0" w:name="Medium List 2 Accent 3"/>
     <w:lsdException w:unhideWhenUsed="0" w:uiPriority="67" w:semiHidden="0" w:name="Medium Grid 1 Accent 3"/>
@@ -19718,7 +19687,7 @@
     <w:lsdException w:qFormat="1" w:unhideWhenUsed="0" w:uiPriority="61" w:semiHidden="0" w:name="Light List Accent 4"/>
     <w:lsdException w:qFormat="1" w:unhideWhenUsed="0" w:uiPriority="62" w:semiHidden="0" w:name="Light Grid Accent 4"/>
     <w:lsdException w:qFormat="1" w:unhideWhenUsed="0" w:uiPriority="63" w:semiHidden="0" w:name="Medium Shading 1 Accent 4"/>
-    <w:lsdException w:qFormat="1" w:unhideWhenUsed="0" w:uiPriority="64" w:semiHidden="0" w:name="Medium Shading 2 Accent 4"/>
+    <w:lsdException w:unhideWhenUsed="0" w:uiPriority="64" w:semiHidden="0" w:name="Medium Shading 2 Accent 4"/>
     <w:lsdException w:unhideWhenUsed="0" w:uiPriority="65" w:semiHidden="0" w:name="Medium List 1 Accent 4"/>
     <w:lsdException w:unhideWhenUsed="0" w:uiPriority="66" w:semiHidden="0" w:name="Medium List 2 Accent 4"/>
     <w:lsdException w:unhideWhenUsed="0" w:uiPriority="67" w:semiHidden="0" w:name="Medium Grid 1 Accent 4"/>
@@ -19744,7 +19713,7 @@
     <w:lsdException w:unhideWhenUsed="0" w:uiPriority="73" w:semiHidden="0" w:name="Colorful Grid Accent 5"/>
     <w:lsdException w:qFormat="1" w:unhideWhenUsed="0" w:uiPriority="60" w:semiHidden="0" w:name="Light Shading Accent 6"/>
     <w:lsdException w:qFormat="1" w:unhideWhenUsed="0" w:uiPriority="61" w:semiHidden="0" w:name="Light List Accent 6"/>
-    <w:lsdException w:qFormat="1" w:unhideWhenUsed="0" w:uiPriority="62" w:semiHidden="0" w:name="Light Grid Accent 6"/>
+    <w:lsdException w:unhideWhenUsed="0" w:uiPriority="62" w:semiHidden="0" w:name="Light Grid Accent 6"/>
     <w:lsdException w:qFormat="1" w:unhideWhenUsed="0" w:uiPriority="63" w:semiHidden="0" w:name="Medium Shading 1 Accent 6"/>
     <w:lsdException w:unhideWhenUsed="0" w:uiPriority="64" w:semiHidden="0" w:name="Medium Shading 2 Accent 6"/>
     <w:lsdException w:unhideWhenUsed="0" w:uiPriority="65" w:semiHidden="0" w:name="Medium List 1 Accent 6"/>

</xml_diff>